<commit_message>
Update final report for DCS151: Refine design methodology section, optimize execution cycle and cycle time explanations, and add new PDF version of the report. Include AI usage log with detailed prompts.
</commit_message>
<xml_diff>
--- a/DCS_FINAL/final_report_dcs151.docx
+++ b/DCS_FINAL/final_report_dcs151.docx
@@ -247,51 +247,22 @@
       </w:pPr>
       <w:r>
         <w:rPr>
-          <w:rFonts w:ascii="Times New Roman" w:eastAsia="標楷體" w:hAnsi="Times New Roman"/>
-          <w:b/>
-          <w:color w:val="000080"/>
-        </w:rPr>
-        <w:t>Architecture</w:t>
-      </w:r>
-      <w:r>
-        <w:rPr>
-          <w:rFonts w:ascii="Times New Roman" w:eastAsia="標楷體" w:hAnsi="Times New Roman"/>
-          <w:b/>
-          <w:color w:val="000080"/>
-        </w:rPr>
-        <w:t xml:space="preserve"> (2 points)</w:t>
-      </w:r>
-    </w:p>
-    <w:p>
-      <w:pPr>
-        <w:rPr>
-          <w:rFonts w:eastAsia="標楷體"/>
-        </w:rPr>
-      </w:pPr>
-      <w:r>
-        <w:rPr>
-          <w:rFonts w:eastAsia="標楷體"/>
-        </w:rPr>
-        <w:t>Draw your architecture diagram or Block diagram</w:t>
-      </w:r>
-    </w:p>
-    <w:p>
-      <w:pPr>
-        <w:jc w:val="center"/>
-        <w:rPr>
-          <w:rFonts w:eastAsia="標楷體"/>
-        </w:rPr>
-      </w:pPr>
-      <w:r>
-        <w:rPr>
           <w:rFonts w:eastAsia="標楷體"/>
           <w:noProof/>
         </w:rPr>
         <w:drawing>
-          <wp:inline distT="0" distB="0" distL="0" distR="0" wp14:anchorId="41CC2126" wp14:editId="36CD8957">
-            <wp:extent cx="6150334" cy="3564579"/>
-            <wp:effectExtent l="0" t="0" r="3175" b="0"/>
-            <wp:docPr id="1093108171" name="圖片 2"/>
+          <wp:anchor distT="0" distB="0" distL="114300" distR="114300" simplePos="0" relativeHeight="251658240" behindDoc="0" locked="0" layoutInCell="1" allowOverlap="1" wp14:anchorId="1156C332" wp14:editId="0F77D115">
+            <wp:simplePos x="0" y="0"/>
+            <wp:positionH relativeFrom="margin">
+              <wp:posOffset>-534670</wp:posOffset>
+            </wp:positionH>
+            <wp:positionV relativeFrom="paragraph">
+              <wp:posOffset>524510</wp:posOffset>
+            </wp:positionV>
+            <wp:extent cx="7256780" cy="4253865"/>
+            <wp:effectExtent l="0" t="0" r="1270" b="0"/>
+            <wp:wrapSquare wrapText="bothSides"/>
+            <wp:docPr id="173867860" name="圖片 1"/>
             <wp:cNvGraphicFramePr>
               <a:graphicFrameLocks xmlns:a="http://schemas.openxmlformats.org/drawingml/2006/main" noChangeAspect="1"/>
             </wp:cNvGraphicFramePr>
@@ -299,18 +270,18 @@
               <a:graphicData uri="http://schemas.openxmlformats.org/drawingml/2006/picture">
                 <pic:pic xmlns:pic="http://schemas.openxmlformats.org/drawingml/2006/picture">
                   <pic:nvPicPr>
-                    <pic:cNvPr id="1093108171" name="圖片 1093108171"/>
+                    <pic:cNvPr id="173867860" name="圖片 173867860"/>
                     <pic:cNvPicPr/>
                   </pic:nvPicPr>
                   <pic:blipFill rotWithShape="1">
-                    <a:blip r:embed="rId8" cstate="print">
+                    <a:blip r:embed="rId8">
                       <a:extLst>
                         <a:ext uri="{28A0092B-C50C-407E-A947-70E740481C1C}">
                           <a14:useLocalDpi xmlns:a14="http://schemas.microsoft.com/office/drawing/2010/main" val="0"/>
                         </a:ext>
                       </a:extLst>
                     </a:blip>
-                    <a:srcRect l="668" t="-1" r="369" b="781"/>
+                    <a:srcRect l="2661" t="3040" r="1219" b="2671"/>
                     <a:stretch>
                       <a:fillRect/>
                     </a:stretch>
@@ -318,7 +289,7 @@
                   <pic:spPr bwMode="auto">
                     <a:xfrm>
                       <a:off x="0" y="0"/>
-                      <a:ext cx="6181011" cy="3582359"/>
+                      <a:ext cx="7256780" cy="4253865"/>
                     </a:xfrm>
                     <a:prstGeom prst="rect">
                       <a:avLst/>
@@ -335,9 +306,38 @@
                 </pic:pic>
               </a:graphicData>
             </a:graphic>
-          </wp:inline>
+            <wp14:sizeRelH relativeFrom="margin">
+              <wp14:pctWidth>0</wp14:pctWidth>
+            </wp14:sizeRelH>
+            <wp14:sizeRelV relativeFrom="margin">
+              <wp14:pctHeight>0</wp14:pctHeight>
+            </wp14:sizeRelV>
+          </wp:anchor>
         </w:drawing>
       </w:r>
+      <w:r>
+        <w:rPr>
+          <w:rFonts w:ascii="Times New Roman" w:eastAsia="標楷體" w:hAnsi="Times New Roman"/>
+          <w:b/>
+          <w:color w:val="000080"/>
+        </w:rPr>
+        <w:t>Architecture</w:t>
+      </w:r>
+      <w:r>
+        <w:rPr>
+          <w:rFonts w:ascii="Times New Roman" w:eastAsia="標楷體" w:hAnsi="Times New Roman"/>
+          <w:b/>
+          <w:color w:val="000080"/>
+        </w:rPr>
+        <w:t xml:space="preserve"> (2 points)</w:t>
+      </w:r>
+    </w:p>
+    <w:p>
+      <w:pPr>
+        <w:rPr>
+          <w:rFonts w:eastAsia="標楷體" w:hint="eastAsia"/>
+        </w:rPr>
+      </w:pPr>
     </w:p>
     <w:p>
       <w:pPr>
@@ -399,9 +399,9 @@
     </w:p>
     <w:p>
       <w:pPr>
-        <w:spacing w:before="240"/>
-        <w:rPr>
-          <w:rFonts w:eastAsia="標楷體"/>
+        <w:spacing w:before="240" w:after="240"/>
+        <w:rPr>
+          <w:rFonts w:eastAsia="標楷體" w:hint="eastAsia"/>
         </w:rPr>
       </w:pPr>
       <w:r>
@@ -590,18 +590,89 @@
         </w:rPr>
         <w:t>，以及最後的資料輸出與寫回。</w:t>
       </w:r>
-    </w:p>
-    <w:p>
-      <w:pPr>
-        <w:rPr>
-          <w:rFonts w:eastAsia="標楷體"/>
-        </w:rPr>
-      </w:pPr>
-      <w:r>
-        <w:rPr>
-          <w:rFonts w:eastAsia="標楷體"/>
-        </w:rPr>
-        <w:t>FSM</w:t>
+      <w:r>
+        <w:rPr>
+          <w:rFonts w:eastAsia="標楷體"/>
+        </w:rPr>
+        <w:t xml:space="preserve">FSM </w:t>
+      </w:r>
+      <w:r>
+        <w:rPr>
+          <w:rFonts w:eastAsia="標楷體"/>
+        </w:rPr>
+        <w:t>主要包含五個狀態：</w:t>
+      </w:r>
+      <w:r>
+        <w:rPr>
+          <w:rFonts w:eastAsia="標楷體"/>
+        </w:rPr>
+        <w:t>S_IDLE</w:t>
+      </w:r>
+      <w:r>
+        <w:rPr>
+          <w:rFonts w:eastAsia="標楷體"/>
+        </w:rPr>
+        <w:t>、</w:t>
+      </w:r>
+      <w:r>
+        <w:rPr>
+          <w:rFonts w:eastAsia="標楷體"/>
+        </w:rPr>
+        <w:t>S_FAST_RUN</w:t>
+      </w:r>
+      <w:r>
+        <w:rPr>
+          <w:rFonts w:eastAsia="標楷體"/>
+        </w:rPr>
+        <w:t>、</w:t>
+      </w:r>
+      <w:r>
+        <w:rPr>
+          <w:rFonts w:eastAsia="標楷體"/>
+        </w:rPr>
+        <w:t>S_ATT_PARAM</w:t>
+      </w:r>
+      <w:r>
+        <w:rPr>
+          <w:rFonts w:eastAsia="標楷體"/>
+        </w:rPr>
+        <w:t>、</w:t>
+      </w:r>
+      <w:r>
+        <w:rPr>
+          <w:rFonts w:eastAsia="標楷體"/>
+        </w:rPr>
+        <w:t>S_ATT_READ</w:t>
+      </w:r>
+      <w:r>
+        <w:rPr>
+          <w:rFonts w:eastAsia="標楷體"/>
+        </w:rPr>
+        <w:t>、</w:t>
+      </w:r>
+      <w:r>
+        <w:rPr>
+          <w:rFonts w:eastAsia="標楷體"/>
+        </w:rPr>
+        <w:t>S_ATT_WAIT</w:t>
+      </w:r>
+      <w:r>
+        <w:rPr>
+          <w:rFonts w:eastAsia="標楷體"/>
+        </w:rPr>
+        <w:t>。當系統位於</w:t>
+      </w:r>
+      <w:r>
+        <w:rPr>
+          <w:rFonts w:eastAsia="標楷體"/>
+        </w:rPr>
+        <w:t xml:space="preserve"> S_IDLE</w:t>
+      </w:r>
+      <w:r>
+        <w:rPr>
+          <w:rFonts w:eastAsia="標楷體"/>
+        </w:rPr>
+        <w:t>，且</w:t>
       </w:r>
       <w:r>
         <w:rPr>
@@ -609,17 +680,76 @@
         </w:rPr>
         <w:t xml:space="preserve"> </w:t>
       </w:r>
-      <w:r>
-        <w:rPr>
-          <w:rFonts w:eastAsia="標楷體"/>
-        </w:rPr>
-        <w:t>主要包含五個狀態：</w:t>
-      </w:r>
-      <w:r>
-        <w:rPr>
-          <w:rFonts w:eastAsia="標楷體"/>
-        </w:rPr>
-        <w:t>S_IDLE</w:t>
+      <w:proofErr w:type="spellStart"/>
+      <w:r>
+        <w:rPr>
+          <w:rFonts w:eastAsia="標楷體"/>
+        </w:rPr>
+        <w:t>mem_set</w:t>
+      </w:r>
+      <w:proofErr w:type="spellEnd"/>
+      <w:r>
+        <w:rPr>
+          <w:rFonts w:eastAsia="標楷體"/>
+        </w:rPr>
+        <w:t xml:space="preserve"> </w:t>
+      </w:r>
+      <w:r>
+        <w:rPr>
+          <w:rFonts w:eastAsia="標楷體"/>
+        </w:rPr>
+        <w:t>與</w:t>
+      </w:r>
+      <w:r>
+        <w:rPr>
+          <w:rFonts w:eastAsia="標楷體"/>
+        </w:rPr>
+        <w:t xml:space="preserve"> </w:t>
+      </w:r>
+      <w:proofErr w:type="spellStart"/>
+      <w:r>
+        <w:rPr>
+          <w:rFonts w:eastAsia="標楷體"/>
+        </w:rPr>
+        <w:t>in_valid</w:t>
+      </w:r>
+      <w:proofErr w:type="spellEnd"/>
+      <w:r>
+        <w:rPr>
+          <w:rFonts w:eastAsia="標楷體"/>
+        </w:rPr>
+        <w:t xml:space="preserve"> </w:t>
+      </w:r>
+      <w:r>
+        <w:rPr>
+          <w:rFonts w:eastAsia="標楷體"/>
+        </w:rPr>
+        <w:t>被拉起時，控制器會接收新的</w:t>
+      </w:r>
+      <w:r>
+        <w:rPr>
+          <w:rFonts w:eastAsia="標楷體"/>
+        </w:rPr>
+        <w:t xml:space="preserve"> operation set</w:t>
+      </w:r>
+      <w:r>
+        <w:rPr>
+          <w:rFonts w:eastAsia="標楷體"/>
+        </w:rPr>
+        <w:t>，</w:t>
+      </w:r>
+      <w:r>
+        <w:rPr>
+          <w:rFonts w:eastAsia="標楷體"/>
+        </w:rPr>
+        <w:lastRenderedPageBreak/>
+        <w:t>並將</w:t>
+      </w:r>
+      <w:r>
+        <w:rPr>
+          <w:rFonts w:eastAsia="標楷體"/>
+        </w:rPr>
+        <w:t xml:space="preserve"> op</w:t>
       </w:r>
       <w:r>
         <w:rPr>
@@ -631,142 +761,6 @@
         <w:rPr>
           <w:rFonts w:eastAsia="標楷體"/>
         </w:rPr>
-        <w:t>S_FAST_RUN</w:t>
-      </w:r>
-      <w:r>
-        <w:rPr>
-          <w:rFonts w:eastAsia="標楷體"/>
-        </w:rPr>
-        <w:t>、</w:t>
-      </w:r>
-      <w:r>
-        <w:rPr>
-          <w:rFonts w:eastAsia="標楷體"/>
-        </w:rPr>
-        <w:t>S_ATT_PARAM</w:t>
-      </w:r>
-      <w:r>
-        <w:rPr>
-          <w:rFonts w:eastAsia="標楷體"/>
-        </w:rPr>
-        <w:t>、</w:t>
-      </w:r>
-      <w:r>
-        <w:rPr>
-          <w:rFonts w:eastAsia="標楷體"/>
-        </w:rPr>
-        <w:t>S_ATT_READ</w:t>
-      </w:r>
-      <w:r>
-        <w:rPr>
-          <w:rFonts w:eastAsia="標楷體"/>
-        </w:rPr>
-        <w:t>、</w:t>
-      </w:r>
-      <w:r>
-        <w:rPr>
-          <w:rFonts w:eastAsia="標楷體"/>
-        </w:rPr>
-        <w:t>S_ATT_WAIT</w:t>
-      </w:r>
-      <w:r>
-        <w:rPr>
-          <w:rFonts w:eastAsia="標楷體"/>
-        </w:rPr>
-        <w:t>。當系統位於</w:t>
-      </w:r>
-      <w:r>
-        <w:rPr>
-          <w:rFonts w:eastAsia="標楷體"/>
-        </w:rPr>
-        <w:t xml:space="preserve"> S_IDLE</w:t>
-      </w:r>
-      <w:r>
-        <w:rPr>
-          <w:rFonts w:eastAsia="標楷體"/>
-        </w:rPr>
-        <w:t>，且</w:t>
-      </w:r>
-      <w:r>
-        <w:rPr>
-          <w:rFonts w:eastAsia="標楷體"/>
-        </w:rPr>
-        <w:t xml:space="preserve"> </w:t>
-      </w:r>
-      <w:proofErr w:type="spellStart"/>
-      <w:r>
-        <w:rPr>
-          <w:rFonts w:eastAsia="標楷體"/>
-        </w:rPr>
-        <w:t>mem_set</w:t>
-      </w:r>
-      <w:proofErr w:type="spellEnd"/>
-      <w:r>
-        <w:rPr>
-          <w:rFonts w:eastAsia="標楷體"/>
-        </w:rPr>
-        <w:t xml:space="preserve"> </w:t>
-      </w:r>
-      <w:r>
-        <w:rPr>
-          <w:rFonts w:eastAsia="標楷體"/>
-        </w:rPr>
-        <w:t>與</w:t>
-      </w:r>
-      <w:r>
-        <w:rPr>
-          <w:rFonts w:eastAsia="標楷體"/>
-        </w:rPr>
-        <w:t xml:space="preserve"> </w:t>
-      </w:r>
-      <w:proofErr w:type="spellStart"/>
-      <w:r>
-        <w:rPr>
-          <w:rFonts w:eastAsia="標楷體"/>
-        </w:rPr>
-        <w:t>in_valid</w:t>
-      </w:r>
-      <w:proofErr w:type="spellEnd"/>
-      <w:r>
-        <w:rPr>
-          <w:rFonts w:eastAsia="標楷體"/>
-        </w:rPr>
-        <w:t xml:space="preserve"> </w:t>
-      </w:r>
-      <w:r>
-        <w:rPr>
-          <w:rFonts w:eastAsia="標楷體"/>
-        </w:rPr>
-        <w:t>被拉起時，控制器會接收新的</w:t>
-      </w:r>
-      <w:r>
-        <w:rPr>
-          <w:rFonts w:eastAsia="標楷體"/>
-        </w:rPr>
-        <w:t xml:space="preserve"> operation set</w:t>
-      </w:r>
-      <w:r>
-        <w:rPr>
-          <w:rFonts w:eastAsia="標楷體"/>
-        </w:rPr>
-        <w:t>，並將</w:t>
-      </w:r>
-      <w:r>
-        <w:rPr>
-          <w:rFonts w:eastAsia="標楷體"/>
-        </w:rPr>
-        <w:t xml:space="preserve"> op</w:t>
-      </w:r>
-      <w:r>
-        <w:rPr>
-          <w:rFonts w:eastAsia="標楷體"/>
-        </w:rPr>
-        <w:t>、</w:t>
-      </w:r>
-      <w:r>
-        <w:rPr>
-          <w:rFonts w:eastAsia="標楷體"/>
-        </w:rPr>
         <w:t xml:space="preserve">act </w:t>
       </w:r>
       <w:r>
@@ -822,19 +816,6 @@
           <w:rFonts w:eastAsia="標楷體"/>
         </w:rPr>
         <w:t>運算流程。</w:t>
-      </w:r>
-    </w:p>
-    <w:p>
-      <w:pPr>
-        <w:rPr>
-          <w:rFonts w:eastAsia="標楷體"/>
-        </w:rPr>
-      </w:pPr>
-      <w:r>
-        <w:rPr>
-          <w:rFonts w:eastAsia="標楷體"/>
-        </w:rPr>
-        <w:tab/>
       </w:r>
     </w:p>
     <w:p>
@@ -853,7 +834,6 @@
         <w:rPr>
           <w:rFonts w:eastAsia="標楷體"/>
         </w:rPr>
-        <w:lastRenderedPageBreak/>
         <w:t>當</w:t>
       </w:r>
       <w:r>
@@ -944,21 +924,7 @@
         <w:rPr>
           <w:rFonts w:eastAsia="標楷體"/>
         </w:rPr>
-        <w:t>的</w:t>
-      </w:r>
-      <w:proofErr w:type="gramStart"/>
-      <w:r>
-        <w:rPr>
-          <w:rFonts w:eastAsia="標楷體"/>
-        </w:rPr>
-        <w:t>前半部與後半</w:t>
-      </w:r>
-      <w:proofErr w:type="gramEnd"/>
-      <w:r>
-        <w:rPr>
-          <w:rFonts w:eastAsia="標楷體"/>
-        </w:rPr>
-        <w:t>部資料，共處理</w:t>
+        <w:t>的前半部與後半部資料，共處理</w:t>
       </w:r>
       <w:r>
         <w:rPr>
@@ -1639,7 +1605,7 @@
     <w:p>
       <w:pPr>
         <w:rPr>
-          <w:rFonts w:eastAsia="標楷體" w:hint="eastAsia"/>
+          <w:rFonts w:eastAsia="標楷體"/>
         </w:rPr>
       </w:pPr>
       <w:r>
@@ -1647,7 +1613,7 @@
           <w:rFonts w:eastAsia="標楷體"/>
         </w:rPr>
         <w:pict w14:anchorId="429CFF28">
-          <v:rect id="_x0000_i1043" style="width:0;height:1.5pt" o:hralign="center" o:hrstd="t" o:hr="t" fillcolor="#a0a0a0" stroked="f"/>
+          <v:rect id="_x0000_i1025" style="width:0;height:1.5pt" o:hralign="center" o:hrstd="t" o:hr="t" fillcolor="#a0a0a0" stroked="f"/>
         </w:pict>
       </w:r>
       <w:r>
@@ -1712,7 +1678,7 @@
         <w:rPr>
           <w:rFonts w:eastAsia="標楷體"/>
         </w:rPr>
-        <w:t xml:space="preserve">FSM </w:t>
+        <w:t>FSM</w:t>
       </w:r>
       <w:r>
         <w:rPr>
@@ -1888,7 +1854,7 @@
     <w:p>
       <w:pPr>
         <w:rPr>
-          <w:rFonts w:eastAsia="標楷體" w:hint="eastAsia"/>
+          <w:rFonts w:eastAsia="標楷體"/>
         </w:rPr>
       </w:pPr>
       <w:r>
@@ -2089,35 +2055,7 @@
         <w:rPr>
           <w:rFonts w:eastAsia="標楷體" w:hint="eastAsia"/>
         </w:rPr>
-        <w:t>可以在前面還</w:t>
-      </w:r>
-      <w:proofErr w:type="gramStart"/>
-      <w:r>
-        <w:rPr>
-          <w:rFonts w:eastAsia="標楷體" w:hint="eastAsia"/>
-        </w:rPr>
-        <w:t>沒算完的</w:t>
-      </w:r>
-      <w:proofErr w:type="gramEnd"/>
-      <w:r>
-        <w:rPr>
-          <w:rFonts w:eastAsia="標楷體" w:hint="eastAsia"/>
-        </w:rPr>
-        <w:t>時候就先發出，這樣</w:t>
-      </w:r>
-      <w:proofErr w:type="gramStart"/>
-      <w:r>
-        <w:rPr>
-          <w:rFonts w:eastAsia="標楷體" w:hint="eastAsia"/>
-        </w:rPr>
-        <w:t>等算完</w:t>
-      </w:r>
-      <w:proofErr w:type="gramEnd"/>
-      <w:r>
-        <w:rPr>
-          <w:rFonts w:eastAsia="標楷體" w:hint="eastAsia"/>
-        </w:rPr>
-        <w:t>沒多久之後，</w:t>
+        <w:t>可以在前面還沒算完的時候就先發出，這樣等算完沒多久之後，</w:t>
       </w:r>
       <w:r>
         <w:rPr>
@@ -2153,11 +2091,12 @@
       <w:r>
         <w:rPr>
           <w:rFonts w:eastAsia="標楷體"/>
+          <w:noProof/>
         </w:rPr>
         <w:drawing>
-          <wp:inline distT="0" distB="0" distL="0" distR="0" wp14:anchorId="5BA782B9" wp14:editId="69CBA1FB">
-            <wp:extent cx="3799694" cy="1674891"/>
-            <wp:effectExtent l="0" t="0" r="0" b="1905"/>
+          <wp:inline distT="0" distB="0" distL="0" distR="0" wp14:anchorId="5BA782B9" wp14:editId="2887F700">
+            <wp:extent cx="4566623" cy="2012950"/>
+            <wp:effectExtent l="0" t="0" r="5715" b="6350"/>
             <wp:docPr id="1218616387" name="圖片 1"/>
             <wp:cNvGraphicFramePr>
               <a:graphicFrameLocks xmlns:a="http://schemas.openxmlformats.org/drawingml/2006/main" noChangeAspect="1"/>
@@ -2178,7 +2117,7 @@
                   <pic:spPr>
                     <a:xfrm>
                       <a:off x="0" y="0"/>
-                      <a:ext cx="3907890" cy="1722583"/>
+                      <a:ext cx="4737922" cy="2088458"/>
                     </a:xfrm>
                     <a:prstGeom prst="rect">
                       <a:avLst/>
@@ -2196,34 +2135,39 @@
         </w:rPr>
         <w:t xml:space="preserve"> </w:t>
       </w:r>
+    </w:p>
+    <w:p>
+      <w:pPr>
+        <w:rPr>
+          <w:rFonts w:eastAsia="標楷體"/>
+        </w:rPr>
+      </w:pPr>
       <w:r>
         <w:rPr>
           <w:rFonts w:eastAsia="標楷體" w:hint="eastAsia"/>
         </w:rPr>
         <w:t>在上筆輸出還沒結束先拉高</w:t>
       </w:r>
-      <w:proofErr w:type="spellStart"/>
       <w:r>
         <w:rPr>
           <w:rFonts w:eastAsia="標楷體" w:hint="eastAsia"/>
         </w:rPr>
         <w:t>rd_en</w:t>
       </w:r>
-      <w:proofErr w:type="spellEnd"/>
-      <w:r>
-        <w:rPr>
-          <w:rFonts w:eastAsia="標楷體"/>
-        </w:rPr>
-        <w:pict w14:anchorId="1BF56951">
-          <v:rect id="_x0000_i1044" style="width:0;height:1.5pt" o:hralign="center" o:hrstd="t" o:hr="t" fillcolor="#a0a0a0" stroked="f"/>
-        </w:pict>
-      </w:r>
+    </w:p>
+    <w:p>
+      <w:pPr>
+        <w:rPr>
+          <w:rFonts w:eastAsia="標楷體"/>
+        </w:rPr>
+      </w:pPr>
       <w:r>
         <w:rPr>
           <w:rFonts w:eastAsia="標楷體"/>
           <w:b/>
           <w:bCs/>
         </w:rPr>
+        <w:lastRenderedPageBreak/>
         <w:t xml:space="preserve">3. Cycle Time Optimization </w:t>
       </w:r>
       <w:r>
@@ -2341,23 +2285,14 @@
         <w:rPr>
           <w:rFonts w:eastAsia="標楷體" w:hint="eastAsia"/>
         </w:rPr>
-        <w:lastRenderedPageBreak/>
         <w:t>在乘法</w:t>
       </w:r>
       <w:r>
         <w:rPr>
           <w:rFonts w:eastAsia="標楷體"/>
         </w:rPr>
-        <w:t>階段中，乘法與加總運算並不是全部放在同一</w:t>
-      </w:r>
-      <w:proofErr w:type="gramStart"/>
-      <w:r>
-        <w:rPr>
-          <w:rFonts w:eastAsia="標楷體"/>
-        </w:rPr>
-        <w:t>個</w:t>
-      </w:r>
-      <w:proofErr w:type="gramEnd"/>
+        <w:t>階段中，乘法與加總運算並不是全部放在同一個</w:t>
+      </w:r>
       <w:r>
         <w:rPr>
           <w:rFonts w:eastAsia="標楷體"/>
@@ -2368,16 +2303,8 @@
         <w:rPr>
           <w:rFonts w:eastAsia="標楷體"/>
         </w:rPr>
-        <w:t>中完成，而是</w:t>
-      </w:r>
-      <w:proofErr w:type="gramStart"/>
-      <w:r>
-        <w:rPr>
-          <w:rFonts w:eastAsia="標楷體"/>
-        </w:rPr>
-        <w:t>透過多級</w:t>
-      </w:r>
-      <w:proofErr w:type="gramEnd"/>
+        <w:t>中完成，而是透過多級</w:t>
+      </w:r>
       <w:r>
         <w:rPr>
           <w:rFonts w:eastAsia="標楷體"/>
@@ -2730,19 +2657,11 @@
         </w:rPr>
         <w:t xml:space="preserve"> 64 </w:t>
       </w:r>
-      <w:proofErr w:type="gramStart"/>
-      <w:r>
-        <w:rPr>
-          <w:rFonts w:eastAsia="標楷體"/>
-        </w:rPr>
-        <w:t>個</w:t>
-      </w:r>
-      <w:proofErr w:type="gramEnd"/>
-      <w:r>
-        <w:rPr>
-          <w:rFonts w:eastAsia="標楷體"/>
-        </w:rPr>
-        <w:t>元素中的最大值，會造成較大的面積與較長的</w:t>
+      <w:r>
+        <w:rPr>
+          <w:rFonts w:eastAsia="標楷體"/>
+        </w:rPr>
+        <w:t>個元素中的最大值，會造成較大的面積與較長的</w:t>
       </w:r>
       <w:r>
         <w:rPr>
@@ -2826,16 +2745,8 @@
         <w:rPr>
           <w:rFonts w:eastAsia="標楷體"/>
         </w:rPr>
-        <w:t>。這種方式比完整大小</w:t>
-      </w:r>
-      <w:proofErr w:type="gramStart"/>
-      <w:r>
-        <w:rPr>
-          <w:rFonts w:eastAsia="標楷體"/>
-        </w:rPr>
-        <w:t>比較器更適合</w:t>
-      </w:r>
-      <w:proofErr w:type="gramEnd"/>
+        <w:t>。這種方式比完整大小比較器更適合</w:t>
+      </w:r>
       <w:r>
         <w:rPr>
           <w:rFonts w:eastAsia="標楷體"/>
@@ -2973,21 +2884,7 @@
         <w:rPr>
           <w:rFonts w:eastAsia="標楷體"/>
         </w:rPr>
-        <w:t>，因此可以降低</w:t>
-      </w:r>
-      <w:proofErr w:type="gramStart"/>
-      <w:r>
-        <w:rPr>
-          <w:rFonts w:eastAsia="標楷體"/>
-        </w:rPr>
-        <w:t>單級乘加</w:t>
-      </w:r>
-      <w:proofErr w:type="gramEnd"/>
-      <w:r>
-        <w:rPr>
-          <w:rFonts w:eastAsia="標楷體"/>
-        </w:rPr>
-        <w:t>路徑的延遲。</w:t>
+        <w:t>，因此可以降低單級乘加路徑的延遲。</w:t>
       </w:r>
     </w:p>
     <w:p>
@@ -3001,7 +2898,7 @@
           <w:rFonts w:eastAsia="標楷體"/>
         </w:rPr>
         <w:pict w14:anchorId="30D5FC5A">
-          <v:rect id="_x0000_i1045" style="width:0;height:1.5pt" o:hralign="center" o:hrstd="t" o:hr="t" fillcolor="#a0a0a0" stroked="f"/>
+          <v:rect id="_x0000_i1027" style="width:0;height:1.5pt" o:hralign="center" o:hrstd="t" o:hr="t" fillcolor="#a0a0a0" stroked="f"/>
         </w:pict>
       </w:r>
       <w:r>
@@ -3029,7 +2926,7 @@
       <w:pPr>
         <w:spacing w:before="240"/>
         <w:rPr>
-          <w:rFonts w:eastAsia="標楷體" w:hint="eastAsia"/>
+          <w:rFonts w:eastAsia="標楷體"/>
         </w:rPr>
       </w:pPr>
       <w:r>
@@ -3111,14 +3008,12 @@
         </w:rPr>
         <w:t xml:space="preserve"> 64 </w:t>
       </w:r>
-      <w:proofErr w:type="gramStart"/>
       <w:r>
         <w:rPr>
           <w:rFonts w:eastAsia="標楷體"/>
         </w:rPr>
         <w:t>個</w:t>
       </w:r>
-      <w:proofErr w:type="gramEnd"/>
       <w:r>
         <w:rPr>
           <w:rFonts w:eastAsia="標楷體"/>
@@ -3155,21 +3050,7 @@
         <w:rPr>
           <w:rFonts w:eastAsia="標楷體"/>
         </w:rPr>
-        <w:t>內部</w:t>
-      </w:r>
-      <w:proofErr w:type="gramStart"/>
-      <w:r>
-        <w:rPr>
-          <w:rFonts w:eastAsia="標楷體"/>
-        </w:rPr>
-        <w:t>進行乘加累積</w:t>
-      </w:r>
-      <w:proofErr w:type="gramEnd"/>
-      <w:r>
-        <w:rPr>
-          <w:rFonts w:eastAsia="標楷體"/>
-        </w:rPr>
-        <w:t>時，才使用較寬的</w:t>
+        <w:t>內部進行乘加累積時，才使用較寬的</w:t>
       </w:r>
       <w:r>
         <w:rPr>
@@ -3370,21 +3251,7 @@
         <w:rPr>
           <w:rFonts w:eastAsia="標楷體"/>
         </w:rPr>
-        <w:t>各自建立一套</w:t>
-      </w:r>
-      <w:proofErr w:type="gramStart"/>
-      <w:r>
-        <w:rPr>
-          <w:rFonts w:eastAsia="標楷體"/>
-        </w:rPr>
-        <w:t>獨立乘加</w:t>
-      </w:r>
-      <w:proofErr w:type="gramEnd"/>
-      <w:r>
-        <w:rPr>
-          <w:rFonts w:eastAsia="標楷體"/>
-        </w:rPr>
-        <w:t>架構</w:t>
+        <w:t>各自建立一套獨立乘加架構</w:t>
       </w:r>
       <w:r>
         <w:rPr>
@@ -3444,16 +3311,8 @@
         <w:rPr>
           <w:rFonts w:eastAsia="標楷體" w:hint="eastAsia"/>
         </w:rPr>
-        <w:t>的計算都是獨立的</w:t>
-      </w:r>
-      <w:proofErr w:type="gramStart"/>
-      <w:r>
-        <w:rPr>
-          <w:rFonts w:eastAsia="標楷體" w:hint="eastAsia"/>
-        </w:rPr>
-        <w:t>乘加器</w:t>
-      </w:r>
-      <w:proofErr w:type="gramEnd"/>
+        <w:t>的計算都是獨立的乘加器</w:t>
+      </w:r>
       <w:r>
         <w:rPr>
           <w:rFonts w:eastAsia="標楷體"/>
@@ -3561,19 +3420,11 @@
         </w:rPr>
         <w:t xml:space="preserve"> 64 </w:t>
       </w:r>
-      <w:proofErr w:type="gramStart"/>
-      <w:r>
-        <w:rPr>
-          <w:rFonts w:eastAsia="標楷體"/>
-        </w:rPr>
-        <w:t>個</w:t>
-      </w:r>
-      <w:proofErr w:type="gramEnd"/>
-      <w:r>
-        <w:rPr>
-          <w:rFonts w:eastAsia="標楷體"/>
-        </w:rPr>
-        <w:t>元素的大小，因此</w:t>
+      <w:r>
+        <w:rPr>
+          <w:rFonts w:eastAsia="標楷體"/>
+        </w:rPr>
+        <w:t>個元素的大小，因此</w:t>
       </w:r>
       <w:r>
         <w:rPr>
@@ -3639,13 +3490,14 @@
     <w:p>
       <w:pPr>
         <w:rPr>
-          <w:rFonts w:eastAsia="標楷體" w:hint="eastAsia"/>
-        </w:rPr>
-      </w:pPr>
-      <w:r>
-        <w:rPr>
-          <w:rFonts w:eastAsia="標楷體"/>
-        </w:rPr>
+          <w:rFonts w:eastAsia="標楷體"/>
+        </w:rPr>
+      </w:pPr>
+      <w:r>
+        <w:rPr>
+          <w:rFonts w:eastAsia="標楷體"/>
+        </w:rPr>
+        <w:lastRenderedPageBreak/>
         <w:tab/>
       </w:r>
       <w:r>
@@ -3772,21 +3624,7 @@
         <w:rPr>
           <w:rFonts w:eastAsia="標楷體" w:hint="eastAsia"/>
         </w:rPr>
-        <w:t>的概念，因此也導致</w:t>
-      </w:r>
-      <w:proofErr w:type="gramStart"/>
-      <w:r>
-        <w:rPr>
-          <w:rFonts w:eastAsia="標楷體" w:hint="eastAsia"/>
-        </w:rPr>
-        <w:t>面積變蠻大</w:t>
-      </w:r>
-      <w:proofErr w:type="gramEnd"/>
-      <w:r>
-        <w:rPr>
-          <w:rFonts w:eastAsia="標楷體" w:hint="eastAsia"/>
-        </w:rPr>
-        <w:t>的，不知道怎麼壓進去，乘法器也沒辦法共用的很多，最後也只能放著很大量的面積</w:t>
+        <w:t>的概念，因此也導致面積變蠻大的，不知道怎麼壓進去，乘法器也沒辦法共用的很多，最後也只能放著很大量的面積</w:t>
       </w:r>
       <w:r>
         <w:rPr>
@@ -3798,14 +3636,7 @@
         <w:rPr>
           <w:rFonts w:eastAsia="標楷體" w:hint="eastAsia"/>
         </w:rPr>
-        <w:t>多</w:t>
-      </w:r>
-      <w:r>
-        <w:rPr>
-          <w:rFonts w:eastAsia="標楷體" w:hint="eastAsia"/>
-        </w:rPr>
-        <w:lastRenderedPageBreak/>
-        <w:t>萬，每次跑合成都要跑很久，剛寫出來的時候甚至還合成超過</w:t>
+        <w:t>多萬，每次跑合成都要跑很久，剛寫出來的時候甚至還合成超過</w:t>
       </w:r>
       <w:r>
         <w:rPr>
@@ -3929,8 +3760,9 @@
     </w:p>
     <w:p>
       <w:pPr>
-        <w:rPr>
-          <w:rFonts w:eastAsia="標楷體"/>
+        <w:spacing w:after="240"/>
+        <w:rPr>
+          <w:rFonts w:eastAsia="標楷體" w:hint="eastAsia"/>
         </w:rPr>
       </w:pPr>
       <w:r>
@@ -3961,21 +3793,7 @@
         <w:rPr>
           <w:rFonts w:eastAsia="標楷體"/>
         </w:rPr>
-        <w:t>二下的必修</w:t>
-      </w:r>
-      <w:proofErr w:type="gramStart"/>
-      <w:r>
-        <w:rPr>
-          <w:rFonts w:eastAsia="標楷體"/>
-        </w:rPr>
-        <w:t>好多，</w:t>
-      </w:r>
-      <w:proofErr w:type="gramEnd"/>
-      <w:r>
-        <w:rPr>
-          <w:rFonts w:eastAsia="標楷體"/>
-        </w:rPr>
-        <w:t>這學期</w:t>
+        <w:t>二下的必修好多，這學期</w:t>
       </w:r>
       <w:r>
         <w:rPr>
@@ -4047,14 +3865,7 @@
         <w:rPr>
           <w:rFonts w:eastAsia="標楷體"/>
         </w:rPr>
-        <w:t>學習到了</w:t>
-      </w:r>
-      <w:proofErr w:type="gramStart"/>
-      <w:r>
-        <w:rPr>
-          <w:rFonts w:eastAsia="標楷體"/>
-        </w:rPr>
-        <w:t>很多</w:t>
+        <w:t>學習到了很多</w:t>
       </w:r>
       <w:r>
         <w:rPr>
@@ -4062,7 +3873,6 @@
         </w:rPr>
         <w:t>切</w:t>
       </w:r>
-      <w:proofErr w:type="gramEnd"/>
       <w:r>
         <w:rPr>
           <w:rFonts w:eastAsia="標楷體" w:hint="eastAsia"/>
@@ -4188,93 +3998,85 @@
       <w:pPr>
         <w:rPr>
           <w:rFonts w:eastAsia="標楷體"/>
-        </w:rPr>
-      </w:pPr>
+          <w:b/>
+          <w:bCs/>
+        </w:rPr>
+      </w:pPr>
+      <w:r>
+        <w:rPr>
+          <w:rFonts w:eastAsia="標楷體" w:hint="eastAsia"/>
+          <w:b/>
+          <w:bCs/>
+        </w:rPr>
+        <w:t>小彩蛋</w:t>
+      </w:r>
+      <w:r>
+        <w:rPr>
+          <w:rFonts w:eastAsia="標楷體" w:hint="eastAsia"/>
+          <w:b/>
+          <w:bCs/>
+        </w:rPr>
+        <w:t xml:space="preserve"> (</w:t>
+      </w:r>
+      <w:r>
+        <w:rPr>
+          <w:rFonts w:eastAsia="標楷體" w:hint="eastAsia"/>
+          <w:b/>
+          <w:bCs/>
+        </w:rPr>
+        <w:t>看助教</w:t>
+      </w:r>
+      <w:r>
+        <w:rPr>
+          <w:rFonts w:eastAsia="標楷體" w:hint="eastAsia"/>
+          <w:b/>
+          <w:bCs/>
+        </w:rPr>
+        <w:t>Pass Pattern</w:t>
+      </w:r>
+      <w:r>
+        <w:rPr>
+          <w:rFonts w:eastAsia="標楷體" w:hint="eastAsia"/>
+          <w:b/>
+          <w:bCs/>
+        </w:rPr>
+        <w:t>太可愛也是</w:t>
+      </w:r>
+      <w:r>
+        <w:rPr>
+          <w:rFonts w:eastAsia="標楷體" w:hint="eastAsia"/>
+          <w:b/>
+          <w:bCs/>
+        </w:rPr>
+        <w:t>自己</w:t>
+      </w:r>
+      <w:r>
+        <w:rPr>
+          <w:rFonts w:eastAsia="標楷體" w:hint="eastAsia"/>
+          <w:b/>
+          <w:bCs/>
+        </w:rPr>
+        <w:t>玩上了</w:t>
+      </w:r>
+      <w:r>
+        <w:rPr>
+          <w:rFonts w:eastAsia="標楷體" w:hint="eastAsia"/>
+          <w:b/>
+          <w:bCs/>
+        </w:rPr>
+        <w:t>~)</w:t>
+      </w:r>
     </w:p>
     <w:p>
       <w:pPr>
         <w:rPr>
           <w:rFonts w:eastAsia="標楷體"/>
-          <w:b/>
-          <w:bCs/>
-        </w:rPr>
-      </w:pPr>
-      <w:proofErr w:type="gramStart"/>
-      <w:r>
-        <w:rPr>
-          <w:rFonts w:eastAsia="標楷體" w:hint="eastAsia"/>
-          <w:b/>
-          <w:bCs/>
-        </w:rPr>
-        <w:t>小彩蛋</w:t>
-      </w:r>
-      <w:proofErr w:type="gramEnd"/>
-      <w:r>
-        <w:rPr>
-          <w:rFonts w:eastAsia="標楷體" w:hint="eastAsia"/>
-          <w:b/>
-          <w:bCs/>
-        </w:rPr>
-        <w:t xml:space="preserve"> (</w:t>
-      </w:r>
-      <w:r>
-        <w:rPr>
-          <w:rFonts w:eastAsia="標楷體" w:hint="eastAsia"/>
-          <w:b/>
-          <w:bCs/>
-        </w:rPr>
-        <w:t>看助教</w:t>
-      </w:r>
-      <w:r>
-        <w:rPr>
-          <w:rFonts w:eastAsia="標楷體" w:hint="eastAsia"/>
-          <w:b/>
-          <w:bCs/>
-        </w:rPr>
-        <w:t>Pass Pattern</w:t>
-      </w:r>
-      <w:r>
-        <w:rPr>
-          <w:rFonts w:eastAsia="標楷體" w:hint="eastAsia"/>
-          <w:b/>
-          <w:bCs/>
-        </w:rPr>
-        <w:t>太可愛也是</w:t>
-      </w:r>
-      <w:r>
-        <w:rPr>
-          <w:rFonts w:eastAsia="標楷體" w:hint="eastAsia"/>
-          <w:b/>
-          <w:bCs/>
-        </w:rPr>
-        <w:t>自己</w:t>
-      </w:r>
-      <w:r>
-        <w:rPr>
-          <w:rFonts w:eastAsia="標楷體" w:hint="eastAsia"/>
-          <w:b/>
-          <w:bCs/>
-        </w:rPr>
-        <w:t>玩上了</w:t>
-      </w:r>
-      <w:r>
-        <w:rPr>
-          <w:rFonts w:eastAsia="標楷體" w:hint="eastAsia"/>
-          <w:b/>
-          <w:bCs/>
-        </w:rPr>
-        <w:t>~)</w:t>
-      </w:r>
-    </w:p>
-    <w:p>
-      <w:pPr>
-        <w:rPr>
-          <w:rFonts w:eastAsia="標楷體" w:hint="eastAsia"/>
-        </w:rPr>
-      </w:pPr>
-      <w:r>
-        <w:rPr>
-          <w:rFonts w:eastAsia="標楷體"/>
+        </w:rPr>
+      </w:pPr>
+      <w:r>
+        <w:rPr>
+          <w:rFonts w:eastAsia="標楷體"/>
+          <w:noProof/>
         </w:rPr>
         <w:drawing>
           <wp:inline distT="0" distB="0" distL="0" distR="0" wp14:anchorId="50C00E97" wp14:editId="5F099742">
@@ -4321,6 +4123,7 @@
       <w:r>
         <w:rPr>
           <w:rFonts w:eastAsia="標楷體"/>
+          <w:noProof/>
         </w:rPr>
         <w:drawing>
           <wp:inline distT="0" distB="0" distL="0" distR="0" wp14:anchorId="502E90C0" wp14:editId="0DDFD3C9">
@@ -4401,19 +4204,6 @@
     </w:p>
     <w:p>
       <w:pPr>
-        <w:rPr>
-          <w:rFonts w:eastAsia="標楷體" w:hint="eastAsia"/>
-        </w:rPr>
-      </w:pPr>
-      <w:r>
-        <w:rPr>
-          <w:rFonts w:eastAsia="標楷體" w:hint="eastAsia"/>
-        </w:rPr>
-        <w:t>Codex + Claude</w:t>
-      </w:r>
-    </w:p>
-    <w:p>
-      <w:pPr>
         <w:pStyle w:val="a6"/>
         <w:numPr>
           <w:ilvl w:val="0"/>
@@ -4450,9 +4240,18 @@
         <w:pStyle w:val="a6"/>
         <w:ind w:leftChars="0" w:left="284"/>
         <w:rPr>
-          <w:rFonts w:eastAsia="標楷體" w:hint="eastAsia"/>
-        </w:rPr>
-      </w:pPr>
+          <w:rFonts w:eastAsia="標楷體"/>
+        </w:rPr>
+      </w:pPr>
+      <w:hyperlink r:id="rId12" w:history="1">
+        <w:r>
+          <w:rPr>
+            <w:rStyle w:val="a7"/>
+            <w:rFonts w:eastAsia="標楷體"/>
+          </w:rPr>
+          <w:t>https://github.com/xiaotin22/NYCU_DCS_2026/blob/main/DCS_FINAL/AI_uselog.md</w:t>
+        </w:r>
+      </w:hyperlink>
     </w:p>
     <w:p>
       <w:pPr>
@@ -4463,7 +4262,7 @@
         </w:numPr>
         <w:ind w:leftChars="0"/>
         <w:rPr>
-          <w:rFonts w:eastAsia="標楷體" w:hint="eastAsia"/>
+          <w:rFonts w:eastAsia="標楷體"/>
         </w:rPr>
       </w:pPr>
       <w:r>
@@ -4496,7 +4295,7 @@
     <w:p>
       <w:pPr>
         <w:rPr>
-          <w:rFonts w:eastAsia="標楷體" w:hint="eastAsia"/>
+          <w:rFonts w:eastAsia="標楷體"/>
         </w:rPr>
       </w:pPr>
       <w:r>
@@ -4527,7 +4326,7 @@
         <w:rPr>
           <w:rFonts w:eastAsia="標楷體" w:hint="eastAsia"/>
         </w:rPr>
-        <w:t xml:space="preserve"> FINAL CA.sv </w:t>
+        <w:t xml:space="preserve"> FINAL CA.sv</w:t>
       </w:r>
       <w:r>
         <w:rPr>
@@ -4539,7 +4338,7 @@
     <w:p>
       <w:pPr>
         <w:rPr>
-          <w:rFonts w:eastAsia="標楷體" w:hint="eastAsia"/>
+          <w:rFonts w:eastAsia="標楷體"/>
         </w:rPr>
       </w:pPr>
       <w:r>
@@ -4594,7 +4393,7 @@
     <w:p>
       <w:pPr>
         <w:rPr>
-          <w:rFonts w:eastAsia="標楷體" w:hint="eastAsia"/>
+          <w:rFonts w:eastAsia="標楷體"/>
         </w:rPr>
       </w:pPr>
       <w:r>
@@ -4613,7 +4412,25 @@
         <w:rPr>
           <w:rFonts w:eastAsia="標楷體" w:hint="eastAsia"/>
         </w:rPr>
-        <w:t>幫我切</w:t>
+        <w:t>幫我</w:t>
+      </w:r>
+      <w:r>
+        <w:rPr>
+          <w:rFonts w:eastAsia="標楷體" w:hint="eastAsia"/>
+        </w:rPr>
+        <w:t>根據</w:t>
+      </w:r>
+      <w:r>
+        <w:rPr>
+          <w:rFonts w:eastAsia="標楷體" w:hint="eastAsia"/>
+        </w:rPr>
+        <w:t>critical path</w:t>
+      </w:r>
+      <w:r>
+        <w:rPr>
+          <w:rFonts w:eastAsia="標楷體" w:hint="eastAsia"/>
+        </w:rPr>
+        <w:t>切</w:t>
       </w:r>
       <w:r>
         <w:rPr>
@@ -4631,7 +4448,7 @@
     <w:p>
       <w:pPr>
         <w:rPr>
-          <w:rFonts w:eastAsia="標楷體" w:hint="eastAsia"/>
+          <w:rFonts w:eastAsia="標楷體"/>
         </w:rPr>
       </w:pPr>
       <w:r>
@@ -4704,19 +4521,11 @@
         </w:rPr>
         <w:t xml:space="preserve"> QKV </w:t>
       </w:r>
-      <w:proofErr w:type="gramStart"/>
-      <w:r>
-        <w:rPr>
-          <w:rFonts w:eastAsia="標楷體" w:hint="eastAsia"/>
-        </w:rPr>
-        <w:t>衝</w:t>
-      </w:r>
-      <w:proofErr w:type="gramEnd"/>
-      <w:r>
-        <w:rPr>
-          <w:rFonts w:eastAsia="標楷體" w:hint="eastAsia"/>
-        </w:rPr>
-        <w:t>到」</w:t>
+      <w:r>
+        <w:rPr>
+          <w:rFonts w:eastAsia="標楷體" w:hint="eastAsia"/>
+        </w:rPr>
+        <w:t>衝到」</w:t>
       </w:r>
     </w:p>
     <w:p>
@@ -7377,6 +7186,7 @@
   <w:style w:type="character" w:default="1" w:styleId="a0">
     <w:name w:val="Default Paragraph Font"/>
     <w:uiPriority w:val="1"/>
+    <w:semiHidden/>
     <w:unhideWhenUsed/>
   </w:style>
   <w:style w:type="table" w:default="1" w:styleId="a1">
@@ -7597,6 +7407,18 @@
       <w:rFonts w:ascii="細明體" w:eastAsia="細明體" w:hAnsi="細明體" w:cs="細明體"/>
       <w:sz w:val="24"/>
       <w:szCs w:val="24"/>
+    </w:rPr>
+  </w:style>
+  <w:style w:type="character" w:styleId="ac">
+    <w:name w:val="Unresolved Mention"/>
+    <w:basedOn w:val="a0"/>
+    <w:uiPriority w:val="99"/>
+    <w:semiHidden/>
+    <w:unhideWhenUsed/>
+    <w:rsid w:val="00A6050D"/>
+    <w:rPr>
+      <w:color w:val="605E5C"/>
+      <w:shd w:val="clear" w:color="auto" w:fill="E1DFDD"/>
     </w:rPr>
   </w:style>
 </w:styles>

</xml_diff>